<commit_message>
v434.2.0: Testakten und Releaseprüfung vertieft
</commit_message>
<xml_diff>
--- a/testakten/bgb-at-altfraenkische-werkstatt/15_eltern_mail_konflikt.docx
+++ b/testakten/bgb-at-altfraenkische-werkstatt/15_eltern_mail_konflikt.docx
@@ -98,7 +98,7 @@
         <w:rPr>
           <w:i/>
         </w:rPr>
-        <w:t>Von: Theudelinde Rabenhaupt &lt;theudelinde.rabenhaupt@webmail.example&gt;</w:t>
+        <w:t>Von: Theudelinde Rabenhaupt &lt;theudelinde.rabenhaupt@webmail.de&gt;</w:t>
       </w:r>
     </w:p>
     <w:p>
@@ -109,7 +109,7 @@
         <w:rPr>
           <w:i/>
         </w:rPr>
-        <w:t>An: Kunigunde Rabenhaupt &lt;kunigunde.rabenhaupt@rabenhaupt-werkstatt.example&gt;</w:t>
+        <w:t>An: Kunigunde Rabenhaupt &lt;kunigunde.rabenhaupt@rabenhaupt-werkstatt.de&gt;</w:t>
       </w:r>
     </w:p>
     <w:p>

</xml_diff>